<commit_message>
Refactor invoice generator & add brand page
Add a company milestone to _data/log.yml and perform a large refactor of generate_invoice.py: simplify and rename helper functions (no_borders, set_cell_borders, lbl, hrule, gap, etc.), consolidate and standardize brand colours and fonts, adjust run() signature, and rework page layout and styling for a print-safe white invoice (page 1) plus a new dark brand page (page 2). Update table structures, column widths, totals/payment sections, and save the regenerated invoice-template.docx (binary updated). These changes improve readability, maintainability, and produce a two-page branded invoice output.
</commit_message>
<xml_diff>
--- a/invoice-template.docx
+++ b/invoice-template.docx
@@ -1,7 +1,6 @@
 
 <file path=word/document.xml><?xml version="1.0" encoding="utf-8"?>
 <w:document xmlns:wpc="http://schemas.microsoft.com/office/word/2010/wordprocessingCanvas" xmlns:mo="http://schemas.microsoft.com/office/mac/office/2008/main" xmlns:mc="http://schemas.openxmlformats.org/markup-compatibility/2006" xmlns:mv="urn:schemas-microsoft-com:mac:vml" xmlns:o="urn:schemas-microsoft-com:office:office" xmlns:r="http://schemas.openxmlformats.org/officeDocument/2006/relationships" xmlns:m="http://schemas.openxmlformats.org/officeDocument/2006/math" xmlns:v="urn:schemas-microsoft-com:vml" xmlns:wp14="http://schemas.microsoft.com/office/word/2010/wordprocessingDrawing" xmlns:wp="http://schemas.openxmlformats.org/drawingml/2006/wordprocessingDrawing" xmlns:w10="urn:schemas-microsoft-com:office:word" xmlns:w="http://schemas.openxmlformats.org/wordprocessingml/2006/main" xmlns:w14="http://schemas.microsoft.com/office/word/2010/wordml" xmlns:wpg="http://schemas.microsoft.com/office/word/2010/wordprocessingGroup" xmlns:wpi="http://schemas.microsoft.com/office/word/2010/wordprocessingInk" xmlns:wne="http://schemas.microsoft.com/office/word/2006/wordml" xmlns:wps="http://schemas.microsoft.com/office/word/2010/wordprocessingShape" mc:Ignorable="w14 wp14">
-  <w:background w:color="0A0A0A"/>
   <w:body>
     <w:tbl>
       <w:tblPr>
@@ -18,69 +17,74 @@
         </w:tblBorders>
       </w:tblPr>
       <w:tblGrid>
-        <w:gridCol w:w="6236"/>
-        <w:gridCol w:w="3969"/>
+        <w:gridCol w:w="4933"/>
+        <w:gridCol w:w="4933"/>
       </w:tblGrid>
       <w:tr>
         <w:tc>
           <w:tcPr>
-            <w:tcW w:type="dxa" w:w="4933"/>
-            <w:shd w:val="clear" w:color="auto" w:fill="0A0A0A"/>
-            <w:vAlign w:val="bottom"/>
+            <w:tcW w:type="dxa" w:w="6463"/>
+            <w:shd w:val="clear" w:color="auto" w:fill="C8FF00"/>
+            <w:vAlign w:val="center"/>
           </w:tcPr>
           <w:p/>
           <w:p>
             <w:pPr>
-              <w:spacing w:after="40"/>
+              <w:spacing w:before="200" w:after="40"/>
             </w:pPr>
             <w:r>
               <w:rPr>
                 <w:rFonts w:ascii="Courier New" w:hAnsi="Courier New"/>
                 <w:b/>
                 <w:i w:val="0"/>
-                <w:color w:val="FFFFFF"/>
+                <w:color w:val="0A0A0A"/>
                 <w:sz w:val="36"/>
               </w:rPr>
-              <w:t xml:space="preserve">BORING </w:t>
-            </w:r>
-            <w:r>
-              <w:rPr>
-                <w:rFonts w:ascii="Courier New" w:hAnsi="Courier New"/>
-                <w:b/>
-                <w:i w:val="0"/>
-                <w:color w:val="C8FF00"/>
-                <w:sz w:val="36"/>
-              </w:rPr>
-              <w:t>SCIENCE</w:t>
+              <w:t>BORING SCIENCE</w:t>
             </w:r>
           </w:p>
           <w:p>
             <w:pPr>
-              <w:spacing w:after="0"/>
+              <w:spacing w:after="200"/>
             </w:pPr>
             <w:r>
               <w:rPr>
                 <w:rFonts w:ascii="Courier New" w:hAnsi="Courier New"/>
                 <w:b w:val="0"/>
                 <w:i w:val="0"/>
-                <w:color w:val="888888"/>
+                <w:color w:val="0A0A0A"/>
                 <w:sz w:val="15"/>
               </w:rPr>
-              <w:t>boringscience.bio  ·  Sunnyvale, CA</w:t>
+              <w:t>boringscience.bio  ·  Sunnyvale, California</w:t>
             </w:r>
           </w:p>
         </w:tc>
         <w:tc>
           <w:tcPr>
-            <w:tcW w:type="dxa" w:w="4933"/>
-            <w:shd w:val="clear" w:color="auto" w:fill="0A0A0A"/>
-            <w:vAlign w:val="bottom"/>
+            <w:tcW w:type="dxa" w:w="3402"/>
+            <w:shd w:val="clear" w:color="auto" w:fill="C8FF00"/>
+            <w:vAlign w:val="center"/>
           </w:tcPr>
-          <w:p/>
           <w:p/>
           <w:p>
             <w:pPr>
-              <w:spacing w:after="40"/>
+              <w:spacing w:before="200" w:after="60"/>
+              <w:jc w:val="right"/>
+            </w:pPr>
+            <w:r>
+              <w:rPr>
+                <w:rFonts w:ascii="Courier New" w:hAnsi="Courier New"/>
+                <w:b w:val="0"/>
+                <w:i w:val="0"/>
+                <w:color w:val="0A0A0A"/>
+                <w:sz w:val="15"/>
+              </w:rPr>
+              <w:t>INVOICE</w:t>
+            </w:r>
+          </w:p>
+          <w:p>
+            <w:pPr>
+              <w:spacing w:after="200"/>
               <w:jc w:val="right"/>
             </w:pPr>
             <w:r>
@@ -88,23 +92,7 @@
                 <w:rFonts w:ascii="Courier New" w:hAnsi="Courier New"/>
                 <w:b/>
                 <w:i w:val="0"/>
-                <w:color w:val="C8FF00"/>
-                <w:sz w:val="15"/>
-              </w:rPr>
-              <w:t>INVOICE</w:t>
-            </w:r>
-          </w:p>
-          <w:p>
-            <w:pPr>
-              <w:spacing w:after="0"/>
-              <w:jc w:val="right"/>
-            </w:pPr>
-            <w:r>
-              <w:rPr>
-                <w:rFonts w:ascii="Courier New" w:hAnsi="Courier New"/>
-                <w:b/>
-                <w:i w:val="0"/>
-                <w:color w:val="FFFFFF"/>
+                <w:color w:val="0A0A0A"/>
                 <w:sz w:val="32"/>
               </w:rPr>
               <w:t>#INV-2026-001</w:t>
@@ -115,10 +103,7 @@
     </w:tbl>
     <w:p>
       <w:pPr>
-        <w:spacing w:before="0" w:after="120"/>
-        <w:pBdr>
-          <w:bottom w:val="single" w:sz="4" w:space="1" w:color="222222"/>
-        </w:pBdr>
+        <w:spacing w:after="160"/>
       </w:pPr>
     </w:p>
     <w:tbl>
@@ -142,46 +127,47 @@
       <w:tr>
         <w:tc>
           <w:tcPr>
-            <w:tcW w:type="dxa" w:w="4933"/>
-            <w:shd w:val="clear" w:color="auto" w:fill="0A0A0A"/>
+            <w:tcW w:type="dxa" w:w="4932"/>
+            <w:shd w:val="clear" w:color="auto" w:fill="FFFFFF"/>
           </w:tcPr>
           <w:p/>
           <w:p>
             <w:pPr>
-              <w:spacing w:after="60"/>
+              <w:spacing w:after="40"/>
             </w:pPr>
             <w:r>
               <w:rPr>
                 <w:rFonts w:ascii="Courier New" w:hAnsi="Courier New"/>
-                <w:b/>
-                <w:color w:val="C8FF00"/>
-                <w:sz w:val="15"/>
+                <w:color w:val="888888"/>
+                <w:sz w:val="14"/>
               </w:rPr>
               <w:t>FROM</w:t>
             </w:r>
           </w:p>
           <w:p>
             <w:pPr>
-              <w:spacing w:after="40"/>
+              <w:spacing w:after="20"/>
             </w:pPr>
             <w:r>
               <w:rPr>
                 <w:rFonts w:ascii="Calibri" w:hAnsi="Calibri"/>
                 <w:b/>
-                <w:color w:val="FFFFFF"/>
-                <w:sz w:val="24"/>
+                <w:i w:val="0"/>
+                <w:color w:val="0A0A0A"/>
+                <w:sz w:val="19"/>
               </w:rPr>
               <w:t>Boring Science LLC</w:t>
             </w:r>
           </w:p>
           <w:p>
             <w:pPr>
-              <w:spacing w:after="40"/>
+              <w:spacing w:after="20"/>
             </w:pPr>
             <w:r>
               <w:rPr>
                 <w:rFonts w:ascii="Calibri" w:hAnsi="Calibri"/>
                 <w:b w:val="0"/>
+                <w:i w:val="0"/>
                 <w:color w:val="888888"/>
                 <w:sz w:val="18"/>
               </w:rPr>
@@ -190,12 +176,13 @@
           </w:p>
           <w:p>
             <w:pPr>
-              <w:spacing w:after="40"/>
+              <w:spacing w:after="20"/>
             </w:pPr>
             <w:r>
               <w:rPr>
                 <w:rFonts w:ascii="Calibri" w:hAnsi="Calibri"/>
                 <w:b w:val="0"/>
+                <w:i w:val="0"/>
                 <w:color w:val="888888"/>
                 <w:sz w:val="18"/>
               </w:rPr>
@@ -204,12 +191,13 @@
           </w:p>
           <w:p>
             <w:pPr>
-              <w:spacing w:after="40"/>
+              <w:spacing w:after="20"/>
             </w:pPr>
             <w:r>
               <w:rPr>
                 <w:rFonts w:ascii="Calibri" w:hAnsi="Calibri"/>
                 <w:b w:val="0"/>
+                <w:i w:val="0"/>
                 <w:color w:val="888888"/>
                 <w:sz w:val="18"/>
               </w:rPr>
@@ -219,46 +207,47 @@
         </w:tc>
         <w:tc>
           <w:tcPr>
-            <w:tcW w:type="dxa" w:w="4933"/>
-            <w:shd w:val="clear" w:color="auto" w:fill="0A0A0A"/>
+            <w:tcW w:type="dxa" w:w="4932"/>
+            <w:shd w:val="clear" w:color="auto" w:fill="FFFFFF"/>
           </w:tcPr>
           <w:p/>
           <w:p>
             <w:pPr>
-              <w:spacing w:after="60"/>
+              <w:spacing w:after="40"/>
             </w:pPr>
             <w:r>
               <w:rPr>
                 <w:rFonts w:ascii="Courier New" w:hAnsi="Courier New"/>
-                <w:b/>
-                <w:color w:val="C8FF00"/>
-                <w:sz w:val="15"/>
+                <w:color w:val="888888"/>
+                <w:sz w:val="14"/>
               </w:rPr>
               <w:t>BILL TO</w:t>
             </w:r>
           </w:p>
           <w:p>
             <w:pPr>
-              <w:spacing w:after="40"/>
+              <w:spacing w:after="20"/>
             </w:pPr>
             <w:r>
               <w:rPr>
                 <w:rFonts w:ascii="Calibri" w:hAnsi="Calibri"/>
                 <w:b/>
-                <w:color w:val="FFFFFF"/>
-                <w:sz w:val="24"/>
+                <w:i w:val="0"/>
+                <w:color w:val="0A0A0A"/>
+                <w:sz w:val="19"/>
               </w:rPr>
               <w:t>Client Name / Organization</w:t>
             </w:r>
           </w:p>
           <w:p>
             <w:pPr>
-              <w:spacing w:after="40"/>
+              <w:spacing w:after="20"/>
             </w:pPr>
             <w:r>
               <w:rPr>
                 <w:rFonts w:ascii="Calibri" w:hAnsi="Calibri"/>
                 <w:b w:val="0"/>
+                <w:i w:val="0"/>
                 <w:color w:val="888888"/>
                 <w:sz w:val="18"/>
               </w:rPr>
@@ -267,12 +256,13 @@
           </w:p>
           <w:p>
             <w:pPr>
-              <w:spacing w:after="40"/>
+              <w:spacing w:after="20"/>
             </w:pPr>
             <w:r>
               <w:rPr>
                 <w:rFonts w:ascii="Calibri" w:hAnsi="Calibri"/>
                 <w:b w:val="0"/>
+                <w:i w:val="0"/>
                 <w:color w:val="888888"/>
                 <w:sz w:val="18"/>
               </w:rPr>
@@ -281,12 +271,13 @@
           </w:p>
           <w:p>
             <w:pPr>
-              <w:spacing w:after="40"/>
+              <w:spacing w:after="20"/>
             </w:pPr>
             <w:r>
               <w:rPr>
                 <w:rFonts w:ascii="Calibri" w:hAnsi="Calibri"/>
                 <w:b w:val="0"/>
+                <w:i w:val="0"/>
                 <w:color w:val="888888"/>
                 <w:sz w:val="18"/>
               </w:rPr>
@@ -298,7 +289,7 @@
     </w:tbl>
     <w:p>
       <w:pPr>
-        <w:spacing w:after="120"/>
+        <w:spacing w:after="160"/>
       </w:pPr>
     </w:p>
     <w:tbl>
@@ -324,111 +315,40 @@
       <w:tr>
         <w:tc>
           <w:tcPr>
-            <w:tcW w:type="dxa" w:w="2551"/>
-            <w:shd w:val="clear" w:color="auto" w:fill="161616"/>
+            <w:tcW w:type="dxa" w:w="2466"/>
+            <w:shd w:val="clear" w:color="auto" w:fill="F5F5F5"/>
+            <w:tcBorders>
+              <w:top w:val="single" w:sz="4" w:space="0" w:color="DDDDDD"/>
+              <w:bottom w:val="single" w:sz="4" w:space="0" w:color="DDDDDD"/>
+              <w:left w:val="single" w:sz="4" w:space="0" w:color="DDDDDD"/>
+              <w:right w:val="single" w:sz="4" w:space="0" w:color="DDDDDD"/>
+            </w:tcBorders>
           </w:tcPr>
           <w:p/>
           <w:p>
             <w:pPr>
-              <w:spacing w:after="40"/>
+              <w:spacing w:after="40" w:before="120"/>
+            </w:pPr>
+            <w:r>
+              <w:rPr>
+                <w:rFonts w:ascii="Courier New" w:hAnsi="Courier New"/>
+                <w:color w:val="888888"/>
+                <w:sz w:val="14"/>
+              </w:rPr>
+              <w:t>ISSUE DATE</w:t>
+            </w:r>
+          </w:p>
+          <w:p>
+            <w:pPr>
+              <w:spacing w:after="120"/>
             </w:pPr>
             <w:r>
               <w:rPr>
                 <w:rFonts w:ascii="Courier New" w:hAnsi="Courier New"/>
                 <w:b w:val="0"/>
                 <w:i w:val="0"/>
-                <w:color w:val="888888"/>
-                <w:sz w:val="14"/>
-              </w:rPr>
-              <w:t>ISSUE DATE</w:t>
-            </w:r>
-          </w:p>
-        </w:tc>
-        <w:tc>
-          <w:tcPr>
-            <w:tcW w:type="dxa" w:w="2551"/>
-            <w:shd w:val="clear" w:color="auto" w:fill="161616"/>
-          </w:tcPr>
-          <w:p/>
-          <w:p>
-            <w:pPr>
-              <w:spacing w:after="40"/>
-            </w:pPr>
-            <w:r>
-              <w:rPr>
-                <w:rFonts w:ascii="Courier New" w:hAnsi="Courier New"/>
-                <w:b w:val="0"/>
-                <w:i w:val="0"/>
-                <w:color w:val="888888"/>
-                <w:sz w:val="14"/>
-              </w:rPr>
-              <w:t>DUE DATE</w:t>
-            </w:r>
-          </w:p>
-        </w:tc>
-        <w:tc>
-          <w:tcPr>
-            <w:tcW w:type="dxa" w:w="2551"/>
-            <w:shd w:val="clear" w:color="auto" w:fill="161616"/>
-          </w:tcPr>
-          <w:p/>
-          <w:p>
-            <w:pPr>
-              <w:spacing w:after="40"/>
-            </w:pPr>
-            <w:r>
-              <w:rPr>
-                <w:rFonts w:ascii="Courier New" w:hAnsi="Courier New"/>
-                <w:b w:val="0"/>
-                <w:i w:val="0"/>
-                <w:color w:val="888888"/>
-                <w:sz w:val="14"/>
-              </w:rPr>
-              <w:t>PROJECT / PO REF</w:t>
-            </w:r>
-          </w:p>
-        </w:tc>
-        <w:tc>
-          <w:tcPr>
-            <w:tcW w:type="dxa" w:w="2551"/>
-            <w:shd w:val="clear" w:color="auto" w:fill="161616"/>
-          </w:tcPr>
-          <w:p/>
-          <w:p>
-            <w:pPr>
-              <w:spacing w:after="40"/>
-            </w:pPr>
-            <w:r>
-              <w:rPr>
-                <w:rFonts w:ascii="Courier New" w:hAnsi="Courier New"/>
-                <w:b w:val="0"/>
-                <w:i w:val="0"/>
-                <w:color w:val="888888"/>
-                <w:sz w:val="14"/>
-              </w:rPr>
-              <w:t>TERMS</w:t>
-            </w:r>
-          </w:p>
-        </w:tc>
-      </w:tr>
-      <w:tr>
-        <w:tc>
-          <w:tcPr>
-            <w:tcW w:type="dxa" w:w="2551"/>
-            <w:shd w:val="clear" w:color="auto" w:fill="161616"/>
-          </w:tcPr>
-          <w:p/>
-          <w:p>
-            <w:pPr>
-              <w:spacing w:after="0"/>
-            </w:pPr>
-            <w:r>
-              <w:rPr>
-                <w:rFonts w:ascii="Courier New" w:hAnsi="Courier New"/>
-                <w:b w:val="0"/>
-                <w:i w:val="0"/>
-                <w:color w:val="FFFFFF"/>
-                <w:sz w:val="20"/>
+                <w:color w:val="0A0A0A"/>
+                <w:sz w:val="18"/>
               </w:rPr>
               <w:t>2026-03-12</w:t>
             </w:r>
@@ -436,21 +356,40 @@
         </w:tc>
         <w:tc>
           <w:tcPr>
-            <w:tcW w:type="dxa" w:w="2551"/>
-            <w:shd w:val="clear" w:color="auto" w:fill="161616"/>
+            <w:tcW w:type="dxa" w:w="2466"/>
+            <w:shd w:val="clear" w:color="auto" w:fill="F5F5F5"/>
+            <w:tcBorders>
+              <w:top w:val="single" w:sz="4" w:space="0" w:color="DDDDDD"/>
+              <w:bottom w:val="single" w:sz="4" w:space="0" w:color="DDDDDD"/>
+              <w:left w:val="single" w:sz="4" w:space="0" w:color="DDDDDD"/>
+              <w:right w:val="single" w:sz="4" w:space="0" w:color="DDDDDD"/>
+            </w:tcBorders>
           </w:tcPr>
           <w:p/>
           <w:p>
             <w:pPr>
-              <w:spacing w:after="0"/>
+              <w:spacing w:after="40" w:before="120"/>
+            </w:pPr>
+            <w:r>
+              <w:rPr>
+                <w:rFonts w:ascii="Courier New" w:hAnsi="Courier New"/>
+                <w:color w:val="888888"/>
+                <w:sz w:val="14"/>
+              </w:rPr>
+              <w:t>DUE DATE</w:t>
+            </w:r>
+          </w:p>
+          <w:p>
+            <w:pPr>
+              <w:spacing w:after="120"/>
             </w:pPr>
             <w:r>
               <w:rPr>
                 <w:rFonts w:ascii="Courier New" w:hAnsi="Courier New"/>
                 <w:b/>
                 <w:i w:val="0"/>
-                <w:color w:val="C8FF00"/>
-                <w:sz w:val="20"/>
+                <w:color w:val="0A0A0A"/>
+                <w:sz w:val="18"/>
               </w:rPr>
               <w:t>2026-04-11</w:t>
             </w:r>
@@ -458,21 +397,40 @@
         </w:tc>
         <w:tc>
           <w:tcPr>
-            <w:tcW w:type="dxa" w:w="2551"/>
-            <w:shd w:val="clear" w:color="auto" w:fill="161616"/>
+            <w:tcW w:type="dxa" w:w="2466"/>
+            <w:shd w:val="clear" w:color="auto" w:fill="F5F5F5"/>
+            <w:tcBorders>
+              <w:top w:val="single" w:sz="4" w:space="0" w:color="DDDDDD"/>
+              <w:bottom w:val="single" w:sz="4" w:space="0" w:color="DDDDDD"/>
+              <w:left w:val="single" w:sz="4" w:space="0" w:color="DDDDDD"/>
+              <w:right w:val="single" w:sz="4" w:space="0" w:color="DDDDDD"/>
+            </w:tcBorders>
           </w:tcPr>
           <w:p/>
           <w:p>
             <w:pPr>
-              <w:spacing w:after="0"/>
+              <w:spacing w:after="40" w:before="120"/>
+            </w:pPr>
+            <w:r>
+              <w:rPr>
+                <w:rFonts w:ascii="Courier New" w:hAnsi="Courier New"/>
+                <w:color w:val="888888"/>
+                <w:sz w:val="14"/>
+              </w:rPr>
+              <w:t>PROJECT / PO REF</w:t>
+            </w:r>
+          </w:p>
+          <w:p>
+            <w:pPr>
+              <w:spacing w:after="120"/>
             </w:pPr>
             <w:r>
               <w:rPr>
                 <w:rFonts w:ascii="Courier New" w:hAnsi="Courier New"/>
                 <w:b w:val="0"/>
                 <w:i w:val="0"/>
-                <w:color w:val="FFFFFF"/>
-                <w:sz w:val="20"/>
+                <w:color w:val="0A0A0A"/>
+                <w:sz w:val="18"/>
               </w:rPr>
               <w:t>BS-PROJECT-001</w:t>
             </w:r>
@@ -480,21 +438,40 @@
         </w:tc>
         <w:tc>
           <w:tcPr>
-            <w:tcW w:type="dxa" w:w="2551"/>
-            <w:shd w:val="clear" w:color="auto" w:fill="161616"/>
+            <w:tcW w:type="dxa" w:w="2466"/>
+            <w:shd w:val="clear" w:color="auto" w:fill="F5F5F5"/>
+            <w:tcBorders>
+              <w:top w:val="single" w:sz="4" w:space="0" w:color="DDDDDD"/>
+              <w:bottom w:val="single" w:sz="4" w:space="0" w:color="DDDDDD"/>
+              <w:left w:val="single" w:sz="4" w:space="0" w:color="DDDDDD"/>
+              <w:right w:val="single" w:sz="4" w:space="0" w:color="DDDDDD"/>
+            </w:tcBorders>
           </w:tcPr>
           <w:p/>
           <w:p>
             <w:pPr>
-              <w:spacing w:after="0"/>
+              <w:spacing w:after="40" w:before="120"/>
+            </w:pPr>
+            <w:r>
+              <w:rPr>
+                <w:rFonts w:ascii="Courier New" w:hAnsi="Courier New"/>
+                <w:color w:val="888888"/>
+                <w:sz w:val="14"/>
+              </w:rPr>
+              <w:t>TERMS</w:t>
+            </w:r>
+          </w:p>
+          <w:p>
+            <w:pPr>
+              <w:spacing w:after="120"/>
             </w:pPr>
             <w:r>
               <w:rPr>
                 <w:rFonts w:ascii="Courier New" w:hAnsi="Courier New"/>
                 <w:b w:val="0"/>
                 <w:i w:val="0"/>
-                <w:color w:val="FFFFFF"/>
-                <w:sz w:val="20"/>
+                <w:color w:val="0A0A0A"/>
+                <w:sz w:val="18"/>
               </w:rPr>
               <w:t>Net 30</w:t>
             </w:r>
@@ -509,15 +486,13 @@
     </w:p>
     <w:p>
       <w:pPr>
-        <w:spacing w:after="80"/>
+        <w:spacing w:after="40"/>
       </w:pPr>
       <w:r>
         <w:rPr>
           <w:rFonts w:ascii="Courier New" w:hAnsi="Courier New"/>
-          <w:b/>
-          <w:i w:val="0"/>
-          <w:color w:val="C8FF00"/>
-          <w:sz w:val="15"/>
+          <w:color w:val="888888"/>
+          <w:sz w:val="14"/>
         </w:rPr>
         <w:t>SERVICES RENDERED</w:t>
       </w:r>
@@ -545,16 +520,17 @@
       <w:tr>
         <w:tc>
           <w:tcPr>
-            <w:tcW w:type="dxa" w:w="5102"/>
-            <w:shd w:val="clear" w:color="auto" w:fill="0A0A0A"/>
+            <w:tcW w:type="dxa" w:w="5556"/>
+            <w:shd w:val="clear" w:color="auto" w:fill="F5F5F5"/>
             <w:tcBorders>
-              <w:bottom w:val="single" w:sz="4" w:space="0" w:color="222222"/>
+              <w:top w:val="single" w:sz="4" w:space="0" w:color="DDDDDD"/>
+              <w:bottom w:val="single" w:sz="6" w:space="0" w:color="0A0A0A"/>
             </w:tcBorders>
           </w:tcPr>
           <w:p/>
           <w:p>
             <w:pPr>
-              <w:spacing w:after="80"/>
+              <w:spacing w:before="80" w:after="80"/>
               <w:jc w:val="left"/>
             </w:pPr>
             <w:r>
@@ -571,16 +547,17 @@
         </w:tc>
         <w:tc>
           <w:tcPr>
-            <w:tcW w:type="dxa" w:w="1587"/>
-            <w:shd w:val="clear" w:color="auto" w:fill="0A0A0A"/>
+            <w:tcW w:type="dxa" w:w="1020"/>
+            <w:shd w:val="clear" w:color="auto" w:fill="F5F5F5"/>
             <w:tcBorders>
-              <w:bottom w:val="single" w:sz="4" w:space="0" w:color="222222"/>
+              <w:top w:val="single" w:sz="4" w:space="0" w:color="DDDDDD"/>
+              <w:bottom w:val="single" w:sz="6" w:space="0" w:color="0A0A0A"/>
             </w:tcBorders>
           </w:tcPr>
           <w:p/>
           <w:p>
             <w:pPr>
-              <w:spacing w:after="80"/>
+              <w:spacing w:before="80" w:after="80"/>
               <w:jc w:val="right"/>
             </w:pPr>
             <w:r>
@@ -591,22 +568,23 @@
                 <w:color w:val="888888"/>
                 <w:sz w:val="14"/>
               </w:rPr>
-              <w:t>QTY / HRS</w:t>
+              <w:t>QTY</w:t>
             </w:r>
           </w:p>
         </w:tc>
         <w:tc>
           <w:tcPr>
-            <w:tcW w:type="dxa" w:w="1701"/>
-            <w:shd w:val="clear" w:color="auto" w:fill="0A0A0A"/>
+            <w:tcW w:type="dxa" w:w="1644"/>
+            <w:shd w:val="clear" w:color="auto" w:fill="F5F5F5"/>
             <w:tcBorders>
-              <w:bottom w:val="single" w:sz="4" w:space="0" w:color="222222"/>
+              <w:top w:val="single" w:sz="4" w:space="0" w:color="DDDDDD"/>
+              <w:bottom w:val="single" w:sz="6" w:space="0" w:color="0A0A0A"/>
             </w:tcBorders>
           </w:tcPr>
           <w:p/>
           <w:p>
             <w:pPr>
-              <w:spacing w:after="80"/>
+              <w:spacing w:before="80" w:after="80"/>
               <w:jc w:val="right"/>
             </w:pPr>
             <w:r>
@@ -623,16 +601,17 @@
         </w:tc>
         <w:tc>
           <w:tcPr>
-            <w:tcW w:type="dxa" w:w="1701"/>
-            <w:shd w:val="clear" w:color="auto" w:fill="0A0A0A"/>
+            <w:tcW w:type="dxa" w:w="1644"/>
+            <w:shd w:val="clear" w:color="auto" w:fill="F5F5F5"/>
             <w:tcBorders>
-              <w:bottom w:val="single" w:sz="4" w:space="0" w:color="222222"/>
+              <w:top w:val="single" w:sz="4" w:space="0" w:color="DDDDDD"/>
+              <w:bottom w:val="single" w:sz="6" w:space="0" w:color="0A0A0A"/>
             </w:tcBorders>
           </w:tcPr>
           <w:p/>
           <w:p>
             <w:pPr>
-              <w:spacing w:after="80"/>
+              <w:spacing w:before="80" w:after="80"/>
               <w:jc w:val="right"/>
             </w:pPr>
             <w:r>
@@ -651,32 +630,32 @@
       <w:tr>
         <w:tc>
           <w:tcPr>
-            <w:tcW w:type="dxa" w:w="5102"/>
-            <w:shd w:val="clear" w:color="auto" w:fill="0A0A0A"/>
+            <w:tcW w:type="dxa" w:w="5556"/>
+            <w:shd w:val="clear" w:color="auto" w:fill="F5F5F5"/>
             <w:tcBorders>
-              <w:bottom w:val="single" w:sz="4" w:space="0" w:color="1a1a1a"/>
+              <w:bottom w:val="single" w:sz="2" w:space="0" w:color="DDDDDD"/>
             </w:tcBorders>
             <w:vAlign w:val="top"/>
           </w:tcPr>
           <w:p/>
           <w:p>
             <w:pPr>
-              <w:spacing w:after="20"/>
+              <w:spacing w:before="100" w:after="20"/>
             </w:pPr>
             <w:r>
               <w:rPr>
                 <w:rFonts w:ascii="Calibri" w:hAnsi="Calibri"/>
                 <w:b/>
                 <w:i w:val="0"/>
-                <w:color w:val="FFFFFF"/>
-                <w:sz w:val="20"/>
+                <w:color w:val="0A0A0A"/>
+                <w:sz w:val="19"/>
               </w:rPr>
               <w:t>Computational Biology Consulting</w:t>
             </w:r>
           </w:p>
           <w:p>
             <w:pPr>
-              <w:spacing w:after="120"/>
+              <w:spacing w:after="100"/>
             </w:pPr>
             <w:r>
               <w:rPr>
@@ -684,7 +663,7 @@
                 <w:b w:val="0"/>
                 <w:i w:val="0"/>
                 <w:color w:val="888888"/>
-                <w:sz w:val="17"/>
+                <w:sz w:val="16"/>
               </w:rPr>
               <w:t>SE(3)-GNN docking pipeline setup and validation</w:t>
             </w:r>
@@ -692,17 +671,17 @@
         </w:tc>
         <w:tc>
           <w:tcPr>
-            <w:tcW w:type="dxa" w:w="1587"/>
-            <w:shd w:val="clear" w:color="auto" w:fill="0A0A0A"/>
+            <w:tcW w:type="dxa" w:w="1020"/>
+            <w:shd w:val="clear" w:color="auto" w:fill="F5F5F5"/>
             <w:tcBorders>
-              <w:bottom w:val="single" w:sz="4" w:space="0" w:color="1a1a1a"/>
+              <w:bottom w:val="single" w:sz="2" w:space="0" w:color="DDDDDD"/>
             </w:tcBorders>
             <w:vAlign w:val="top"/>
           </w:tcPr>
           <w:p/>
           <w:p>
             <w:pPr>
-              <w:spacing w:after="120"/>
+              <w:spacing w:before="100" w:after="100"/>
               <w:jc w:val="right"/>
             </w:pPr>
             <w:r>
@@ -710,26 +689,26 @@
                 <w:rFonts w:ascii="Courier New" w:hAnsi="Courier New"/>
                 <w:b w:val="0"/>
                 <w:i w:val="0"/>
-                <w:color w:val="C8C8C8"/>
+                <w:color w:val="0A0A0A"/>
                 <w:sz w:val="18"/>
               </w:rPr>
-              <w:t>16</w:t>
+              <w:t>16 hrs</w:t>
             </w:r>
           </w:p>
         </w:tc>
         <w:tc>
           <w:tcPr>
-            <w:tcW w:type="dxa" w:w="1701"/>
-            <w:shd w:val="clear" w:color="auto" w:fill="0A0A0A"/>
+            <w:tcW w:type="dxa" w:w="1644"/>
+            <w:shd w:val="clear" w:color="auto" w:fill="F5F5F5"/>
             <w:tcBorders>
-              <w:bottom w:val="single" w:sz="4" w:space="0" w:color="1a1a1a"/>
+              <w:bottom w:val="single" w:sz="2" w:space="0" w:color="DDDDDD"/>
             </w:tcBorders>
             <w:vAlign w:val="top"/>
           </w:tcPr>
           <w:p/>
           <w:p>
             <w:pPr>
-              <w:spacing w:after="120"/>
+              <w:spacing w:before="100" w:after="100"/>
               <w:jc w:val="right"/>
             </w:pPr>
             <w:r>
@@ -737,7 +716,7 @@
                 <w:rFonts w:ascii="Courier New" w:hAnsi="Courier New"/>
                 <w:b w:val="0"/>
                 <w:i w:val="0"/>
-                <w:color w:val="C8C8C8"/>
+                <w:color w:val="0A0A0A"/>
                 <w:sz w:val="18"/>
               </w:rPr>
               <w:t>$250.00</w:t>
@@ -746,17 +725,17 @@
         </w:tc>
         <w:tc>
           <w:tcPr>
-            <w:tcW w:type="dxa" w:w="1701"/>
-            <w:shd w:val="clear" w:color="auto" w:fill="0A0A0A"/>
+            <w:tcW w:type="dxa" w:w="1644"/>
+            <w:shd w:val="clear" w:color="auto" w:fill="F5F5F5"/>
             <w:tcBorders>
-              <w:bottom w:val="single" w:sz="4" w:space="0" w:color="1a1a1a"/>
+              <w:bottom w:val="single" w:sz="2" w:space="0" w:color="DDDDDD"/>
             </w:tcBorders>
             <w:vAlign w:val="top"/>
           </w:tcPr>
           <w:p/>
           <w:p>
             <w:pPr>
-              <w:spacing w:after="120"/>
+              <w:spacing w:before="100" w:after="100"/>
               <w:jc w:val="right"/>
             </w:pPr>
             <w:r>
@@ -764,7 +743,7 @@
                 <w:rFonts w:ascii="Courier New" w:hAnsi="Courier New"/>
                 <w:b/>
                 <w:i w:val="0"/>
-                <w:color w:val="FFFFFF"/>
+                <w:color w:val="0A0A0A"/>
                 <w:sz w:val="18"/>
               </w:rPr>
               <w:t>$4,000.00</w:t>
@@ -775,32 +754,32 @@
       <w:tr>
         <w:tc>
           <w:tcPr>
-            <w:tcW w:type="dxa" w:w="5102"/>
-            <w:shd w:val="clear" w:color="auto" w:fill="0A0A0A"/>
+            <w:tcW w:type="dxa" w:w="5556"/>
+            <w:shd w:val="clear" w:color="auto" w:fill="FFFFFF"/>
             <w:tcBorders>
-              <w:bottom w:val="single" w:sz="4" w:space="0" w:color="1a1a1a"/>
+              <w:bottom w:val="single" w:sz="2" w:space="0" w:color="DDDDDD"/>
             </w:tcBorders>
             <w:vAlign w:val="top"/>
           </w:tcPr>
           <w:p/>
           <w:p>
             <w:pPr>
-              <w:spacing w:after="20"/>
+              <w:spacing w:before="100" w:after="20"/>
             </w:pPr>
             <w:r>
               <w:rPr>
                 <w:rFonts w:ascii="Calibri" w:hAnsi="Calibri"/>
                 <w:b/>
                 <w:i w:val="0"/>
-                <w:color w:val="FFFFFF"/>
-                <w:sz w:val="20"/>
+                <w:color w:val="0A0A0A"/>
+                <w:sz w:val="19"/>
               </w:rPr>
               <w:t>NGS Pipeline Engineering</w:t>
             </w:r>
           </w:p>
           <w:p>
             <w:pPr>
-              <w:spacing w:after="120"/>
+              <w:spacing w:after="100"/>
             </w:pPr>
             <w:r>
               <w:rPr>
@@ -808,7 +787,7 @@
                 <w:b w:val="0"/>
                 <w:i w:val="0"/>
                 <w:color w:val="888888"/>
-                <w:sz w:val="17"/>
+                <w:sz w:val="16"/>
               </w:rPr>
               <w:t>Nextflow DSL2 WGS pipeline — containerization &amp; CI</w:t>
             </w:r>
@@ -816,17 +795,17 @@
         </w:tc>
         <w:tc>
           <w:tcPr>
-            <w:tcW w:type="dxa" w:w="1587"/>
-            <w:shd w:val="clear" w:color="auto" w:fill="0A0A0A"/>
+            <w:tcW w:type="dxa" w:w="1020"/>
+            <w:shd w:val="clear" w:color="auto" w:fill="FFFFFF"/>
             <w:tcBorders>
-              <w:bottom w:val="single" w:sz="4" w:space="0" w:color="1a1a1a"/>
+              <w:bottom w:val="single" w:sz="2" w:space="0" w:color="DDDDDD"/>
             </w:tcBorders>
             <w:vAlign w:val="top"/>
           </w:tcPr>
           <w:p/>
           <w:p>
             <w:pPr>
-              <w:spacing w:after="120"/>
+              <w:spacing w:before="100" w:after="100"/>
               <w:jc w:val="right"/>
             </w:pPr>
             <w:r>
@@ -834,26 +813,26 @@
                 <w:rFonts w:ascii="Courier New" w:hAnsi="Courier New"/>
                 <w:b w:val="0"/>
                 <w:i w:val="0"/>
-                <w:color w:val="C8C8C8"/>
+                <w:color w:val="0A0A0A"/>
                 <w:sz w:val="18"/>
               </w:rPr>
-              <w:t>24</w:t>
+              <w:t>24 hrs</w:t>
             </w:r>
           </w:p>
         </w:tc>
         <w:tc>
           <w:tcPr>
-            <w:tcW w:type="dxa" w:w="1701"/>
-            <w:shd w:val="clear" w:color="auto" w:fill="0A0A0A"/>
+            <w:tcW w:type="dxa" w:w="1644"/>
+            <w:shd w:val="clear" w:color="auto" w:fill="FFFFFF"/>
             <w:tcBorders>
-              <w:bottom w:val="single" w:sz="4" w:space="0" w:color="1a1a1a"/>
+              <w:bottom w:val="single" w:sz="2" w:space="0" w:color="DDDDDD"/>
             </w:tcBorders>
             <w:vAlign w:val="top"/>
           </w:tcPr>
           <w:p/>
           <w:p>
             <w:pPr>
-              <w:spacing w:after="120"/>
+              <w:spacing w:before="100" w:after="100"/>
               <w:jc w:val="right"/>
             </w:pPr>
             <w:r>
@@ -861,7 +840,7 @@
                 <w:rFonts w:ascii="Courier New" w:hAnsi="Courier New"/>
                 <w:b w:val="0"/>
                 <w:i w:val="0"/>
-                <w:color w:val="C8C8C8"/>
+                <w:color w:val="0A0A0A"/>
                 <w:sz w:val="18"/>
               </w:rPr>
               <w:t>$250.00</w:t>
@@ -870,17 +849,17 @@
         </w:tc>
         <w:tc>
           <w:tcPr>
-            <w:tcW w:type="dxa" w:w="1701"/>
-            <w:shd w:val="clear" w:color="auto" w:fill="0A0A0A"/>
+            <w:tcW w:type="dxa" w:w="1644"/>
+            <w:shd w:val="clear" w:color="auto" w:fill="FFFFFF"/>
             <w:tcBorders>
-              <w:bottom w:val="single" w:sz="4" w:space="0" w:color="1a1a1a"/>
+              <w:bottom w:val="single" w:sz="2" w:space="0" w:color="DDDDDD"/>
             </w:tcBorders>
             <w:vAlign w:val="top"/>
           </w:tcPr>
           <w:p/>
           <w:p>
             <w:pPr>
-              <w:spacing w:after="120"/>
+              <w:spacing w:before="100" w:after="100"/>
               <w:jc w:val="right"/>
             </w:pPr>
             <w:r>
@@ -888,7 +867,7 @@
                 <w:rFonts w:ascii="Courier New" w:hAnsi="Courier New"/>
                 <w:b/>
                 <w:i w:val="0"/>
-                <w:color w:val="FFFFFF"/>
+                <w:color w:val="0A0A0A"/>
                 <w:sz w:val="18"/>
               </w:rPr>
               <w:t>$6,000.00</w:t>
@@ -899,32 +878,32 @@
       <w:tr>
         <w:tc>
           <w:tcPr>
-            <w:tcW w:type="dxa" w:w="5102"/>
-            <w:shd w:val="clear" w:color="auto" w:fill="0A0A0A"/>
+            <w:tcW w:type="dxa" w:w="5556"/>
+            <w:shd w:val="clear" w:color="auto" w:fill="F5F5F5"/>
             <w:tcBorders>
-              <w:bottom w:val="single" w:sz="4" w:space="0" w:color="1a1a1a"/>
+              <w:bottom w:val="single" w:sz="2" w:space="0" w:color="DDDDDD"/>
             </w:tcBorders>
             <w:vAlign w:val="top"/>
           </w:tcPr>
           <w:p/>
           <w:p>
             <w:pPr>
-              <w:spacing w:after="20"/>
+              <w:spacing w:before="100" w:after="20"/>
             </w:pPr>
             <w:r>
               <w:rPr>
                 <w:rFonts w:ascii="Calibri" w:hAnsi="Calibri"/>
                 <w:b/>
                 <w:i w:val="0"/>
-                <w:color w:val="FFFFFF"/>
-                <w:sz w:val="20"/>
+                <w:color w:val="0A0A0A"/>
+                <w:sz w:val="19"/>
               </w:rPr>
               <w:t>bsdock License — Annual</w:t>
             </w:r>
           </w:p>
           <w:p>
             <w:pPr>
-              <w:spacing w:after="120"/>
+              <w:spacing w:after="100"/>
             </w:pPr>
             <w:r>
               <w:rPr>
@@ -932,7 +911,7 @@
                 <w:b w:val="0"/>
                 <w:i w:val="0"/>
                 <w:color w:val="888888"/>
-                <w:sz w:val="17"/>
+                <w:sz w:val="16"/>
               </w:rPr>
               <w:t>Single-site, unlimited users. Includes support &amp; updates.</w:t>
             </w:r>
@@ -940,17 +919,17 @@
         </w:tc>
         <w:tc>
           <w:tcPr>
-            <w:tcW w:type="dxa" w:w="1587"/>
-            <w:shd w:val="clear" w:color="auto" w:fill="0A0A0A"/>
+            <w:tcW w:type="dxa" w:w="1020"/>
+            <w:shd w:val="clear" w:color="auto" w:fill="F5F5F5"/>
             <w:tcBorders>
-              <w:bottom w:val="single" w:sz="4" w:space="0" w:color="1a1a1a"/>
+              <w:bottom w:val="single" w:sz="2" w:space="0" w:color="DDDDDD"/>
             </w:tcBorders>
             <w:vAlign w:val="top"/>
           </w:tcPr>
           <w:p/>
           <w:p>
             <w:pPr>
-              <w:spacing w:after="120"/>
+              <w:spacing w:before="100" w:after="100"/>
               <w:jc w:val="right"/>
             </w:pPr>
             <w:r>
@@ -958,7 +937,7 @@
                 <w:rFonts w:ascii="Courier New" w:hAnsi="Courier New"/>
                 <w:b w:val="0"/>
                 <w:i w:val="0"/>
-                <w:color w:val="C8C8C8"/>
+                <w:color w:val="0A0A0A"/>
                 <w:sz w:val="18"/>
               </w:rPr>
               <w:t>1</w:t>
@@ -967,17 +946,17 @@
         </w:tc>
         <w:tc>
           <w:tcPr>
-            <w:tcW w:type="dxa" w:w="1701"/>
-            <w:shd w:val="clear" w:color="auto" w:fill="0A0A0A"/>
+            <w:tcW w:type="dxa" w:w="1644"/>
+            <w:shd w:val="clear" w:color="auto" w:fill="F5F5F5"/>
             <w:tcBorders>
-              <w:bottom w:val="single" w:sz="4" w:space="0" w:color="1a1a1a"/>
+              <w:bottom w:val="single" w:sz="2" w:space="0" w:color="DDDDDD"/>
             </w:tcBorders>
             <w:vAlign w:val="top"/>
           </w:tcPr>
           <w:p/>
           <w:p>
             <w:pPr>
-              <w:spacing w:after="120"/>
+              <w:spacing w:before="100" w:after="100"/>
               <w:jc w:val="right"/>
             </w:pPr>
             <w:r>
@@ -985,7 +964,7 @@
                 <w:rFonts w:ascii="Courier New" w:hAnsi="Courier New"/>
                 <w:b w:val="0"/>
                 <w:i w:val="0"/>
-                <w:color w:val="C8C8C8"/>
+                <w:color w:val="0A0A0A"/>
                 <w:sz w:val="18"/>
               </w:rPr>
               <w:t>$3,500.00</w:t>
@@ -994,17 +973,17 @@
         </w:tc>
         <w:tc>
           <w:tcPr>
-            <w:tcW w:type="dxa" w:w="1701"/>
-            <w:shd w:val="clear" w:color="auto" w:fill="0A0A0A"/>
+            <w:tcW w:type="dxa" w:w="1644"/>
+            <w:shd w:val="clear" w:color="auto" w:fill="F5F5F5"/>
             <w:tcBorders>
-              <w:bottom w:val="single" w:sz="4" w:space="0" w:color="1a1a1a"/>
+              <w:bottom w:val="single" w:sz="2" w:space="0" w:color="DDDDDD"/>
             </w:tcBorders>
             <w:vAlign w:val="top"/>
           </w:tcPr>
           <w:p/>
           <w:p>
             <w:pPr>
-              <w:spacing w:after="120"/>
+              <w:spacing w:before="100" w:after="100"/>
               <w:jc w:val="right"/>
             </w:pPr>
             <w:r>
@@ -1012,7 +991,7 @@
                 <w:rFonts w:ascii="Courier New" w:hAnsi="Courier New"/>
                 <w:b/>
                 <w:i w:val="0"/>
-                <w:color w:val="FFFFFF"/>
+                <w:color w:val="0A0A0A"/>
                 <w:sz w:val="18"/>
               </w:rPr>
               <w:t>$3,500.00</w:t>
@@ -1023,32 +1002,32 @@
       <w:tr>
         <w:tc>
           <w:tcPr>
-            <w:tcW w:type="dxa" w:w="5102"/>
-            <w:shd w:val="clear" w:color="auto" w:fill="0A0A0A"/>
+            <w:tcW w:type="dxa" w:w="5556"/>
+            <w:shd w:val="clear" w:color="auto" w:fill="FFFFFF"/>
             <w:tcBorders>
-              <w:bottom w:val="single" w:sz="4" w:space="0" w:color="1a1a1a"/>
+              <w:bottom w:val="single" w:sz="2" w:space="0" w:color="DDDDDD"/>
             </w:tcBorders>
             <w:vAlign w:val="top"/>
           </w:tcPr>
           <w:p/>
           <w:p>
             <w:pPr>
-              <w:spacing w:after="20"/>
+              <w:spacing w:before="100" w:after="20"/>
             </w:pPr>
             <w:r>
               <w:rPr>
                 <w:rFonts w:ascii="Calibri" w:hAnsi="Calibri"/>
                 <w:b/>
                 <w:i w:val="0"/>
-                <w:color w:val="FFFFFF"/>
-                <w:sz w:val="20"/>
+                <w:color w:val="0A0A0A"/>
+                <w:sz w:val="19"/>
               </w:rPr>
               <w:t>Data Report &amp; Documentation</w:t>
             </w:r>
           </w:p>
           <w:p>
             <w:pPr>
-              <w:spacing w:after="120"/>
+              <w:spacing w:after="100"/>
             </w:pPr>
             <w:r>
               <w:rPr>
@@ -1056,25 +1035,25 @@
                 <w:b w:val="0"/>
                 <w:i w:val="0"/>
                 <w:color w:val="888888"/>
-                <w:sz w:val="17"/>
+                <w:sz w:val="16"/>
               </w:rPr>
-              <w:t>Technical report, methodology writeup, reproducibility package</w:t>
+              <w:t>Technical report, methodology writeup, reproducibility pkg</w:t>
             </w:r>
           </w:p>
         </w:tc>
         <w:tc>
           <w:tcPr>
-            <w:tcW w:type="dxa" w:w="1587"/>
-            <w:shd w:val="clear" w:color="auto" w:fill="0A0A0A"/>
+            <w:tcW w:type="dxa" w:w="1020"/>
+            <w:shd w:val="clear" w:color="auto" w:fill="FFFFFF"/>
             <w:tcBorders>
-              <w:bottom w:val="single" w:sz="4" w:space="0" w:color="1a1a1a"/>
+              <w:bottom w:val="single" w:sz="2" w:space="0" w:color="DDDDDD"/>
             </w:tcBorders>
             <w:vAlign w:val="top"/>
           </w:tcPr>
           <w:p/>
           <w:p>
             <w:pPr>
-              <w:spacing w:after="120"/>
+              <w:spacing w:before="100" w:after="100"/>
               <w:jc w:val="right"/>
             </w:pPr>
             <w:r>
@@ -1082,26 +1061,26 @@
                 <w:rFonts w:ascii="Courier New" w:hAnsi="Courier New"/>
                 <w:b w:val="0"/>
                 <w:i w:val="0"/>
-                <w:color w:val="C8C8C8"/>
+                <w:color w:val="0A0A0A"/>
                 <w:sz w:val="18"/>
               </w:rPr>
-              <w:t>8</w:t>
+              <w:t>8 hrs</w:t>
             </w:r>
           </w:p>
         </w:tc>
         <w:tc>
           <w:tcPr>
-            <w:tcW w:type="dxa" w:w="1701"/>
-            <w:shd w:val="clear" w:color="auto" w:fill="0A0A0A"/>
+            <w:tcW w:type="dxa" w:w="1644"/>
+            <w:shd w:val="clear" w:color="auto" w:fill="FFFFFF"/>
             <w:tcBorders>
-              <w:bottom w:val="single" w:sz="4" w:space="0" w:color="1a1a1a"/>
+              <w:bottom w:val="single" w:sz="2" w:space="0" w:color="DDDDDD"/>
             </w:tcBorders>
             <w:vAlign w:val="top"/>
           </w:tcPr>
           <w:p/>
           <w:p>
             <w:pPr>
-              <w:spacing w:after="120"/>
+              <w:spacing w:before="100" w:after="100"/>
               <w:jc w:val="right"/>
             </w:pPr>
             <w:r>
@@ -1109,7 +1088,7 @@
                 <w:rFonts w:ascii="Courier New" w:hAnsi="Courier New"/>
                 <w:b w:val="0"/>
                 <w:i w:val="0"/>
-                <w:color w:val="C8C8C8"/>
+                <w:color w:val="0A0A0A"/>
                 <w:sz w:val="18"/>
               </w:rPr>
               <w:t>$200.00</w:t>
@@ -1118,17 +1097,17 @@
         </w:tc>
         <w:tc>
           <w:tcPr>
-            <w:tcW w:type="dxa" w:w="1701"/>
-            <w:shd w:val="clear" w:color="auto" w:fill="0A0A0A"/>
+            <w:tcW w:type="dxa" w:w="1644"/>
+            <w:shd w:val="clear" w:color="auto" w:fill="FFFFFF"/>
             <w:tcBorders>
-              <w:bottom w:val="single" w:sz="4" w:space="0" w:color="1a1a1a"/>
+              <w:bottom w:val="single" w:sz="2" w:space="0" w:color="DDDDDD"/>
             </w:tcBorders>
             <w:vAlign w:val="top"/>
           </w:tcPr>
           <w:p/>
           <w:p>
             <w:pPr>
-              <w:spacing w:after="120"/>
+              <w:spacing w:before="100" w:after="100"/>
               <w:jc w:val="right"/>
             </w:pPr>
             <w:r>
@@ -1136,7 +1115,7 @@
                 <w:rFonts w:ascii="Courier New" w:hAnsi="Courier New"/>
                 <w:b/>
                 <w:i w:val="0"/>
-                <w:color w:val="FFFFFF"/>
+                <w:color w:val="0A0A0A"/>
                 <w:sz w:val="18"/>
               </w:rPr>
               <w:t>$1,600.00</w:t>
@@ -1171,13 +1150,13 @@
       <w:tr>
         <w:tc>
           <w:tcPr>
-            <w:tcW w:type="dxa" w:w="2551"/>
-            <w:shd w:val="clear" w:color="auto" w:fill="0A0A0A"/>
+            <w:tcW w:type="dxa" w:w="2268"/>
+            <w:shd w:val="clear" w:color="auto" w:fill="FFFFFF"/>
           </w:tcPr>
           <w:p/>
           <w:p>
             <w:pPr>
-              <w:spacing w:after="60"/>
+              <w:spacing w:after="40"/>
             </w:pPr>
             <w:r>
               <w:rPr>
@@ -1193,13 +1172,13 @@
         </w:tc>
         <w:tc>
           <w:tcPr>
-            <w:tcW w:type="dxa" w:w="1701"/>
-            <w:shd w:val="clear" w:color="auto" w:fill="0A0A0A"/>
+            <w:tcW w:type="dxa" w:w="1984"/>
+            <w:shd w:val="clear" w:color="auto" w:fill="FFFFFF"/>
           </w:tcPr>
           <w:p/>
           <w:p>
             <w:pPr>
-              <w:spacing w:after="60"/>
+              <w:spacing w:after="40"/>
               <w:jc w:val="right"/>
             </w:pPr>
             <w:r>
@@ -1207,7 +1186,7 @@
                 <w:rFonts w:ascii="Courier New" w:hAnsi="Courier New"/>
                 <w:b w:val="0"/>
                 <w:i w:val="0"/>
-                <w:color w:val="C8C8C8"/>
+                <w:color w:val="0A0A0A"/>
                 <w:sz w:val="18"/>
               </w:rPr>
               <w:t>$15,100.00</w:t>
@@ -1218,13 +1197,13 @@
       <w:tr>
         <w:tc>
           <w:tcPr>
-            <w:tcW w:type="dxa" w:w="2551"/>
-            <w:shd w:val="clear" w:color="auto" w:fill="0A0A0A"/>
+            <w:tcW w:type="dxa" w:w="2268"/>
+            <w:shd w:val="clear" w:color="auto" w:fill="FFFFFF"/>
           </w:tcPr>
           <w:p/>
           <w:p>
             <w:pPr>
-              <w:spacing w:after="60"/>
+              <w:spacing w:after="40"/>
             </w:pPr>
             <w:r>
               <w:rPr>
@@ -1240,13 +1219,13 @@
         </w:tc>
         <w:tc>
           <w:tcPr>
-            <w:tcW w:type="dxa" w:w="1701"/>
-            <w:shd w:val="clear" w:color="auto" w:fill="0A0A0A"/>
+            <w:tcW w:type="dxa" w:w="1984"/>
+            <w:shd w:val="clear" w:color="auto" w:fill="FFFFFF"/>
           </w:tcPr>
           <w:p/>
           <w:p>
             <w:pPr>
-              <w:spacing w:after="60"/>
+              <w:spacing w:after="40"/>
               <w:jc w:val="right"/>
             </w:pPr>
             <w:r>
@@ -1254,7 +1233,7 @@
                 <w:rFonts w:ascii="Courier New" w:hAnsi="Courier New"/>
                 <w:b w:val="0"/>
                 <w:i w:val="0"/>
-                <w:color w:val="C8C8C8"/>
+                <w:color w:val="0A0A0A"/>
                 <w:sz w:val="18"/>
               </w:rPr>
               <w:t>$0.00</w:t>
@@ -1265,16 +1244,13 @@
       <w:tr>
         <w:tc>
           <w:tcPr>
-            <w:tcW w:type="dxa" w:w="2551"/>
-            <w:shd w:val="clear" w:color="auto" w:fill="0A0A0A"/>
-            <w:tcBorders>
-              <w:bottom w:val="single" w:sz="4" w:space="0" w:color="222222"/>
-            </w:tcBorders>
+            <w:tcW w:type="dxa" w:w="2268"/>
+            <w:shd w:val="clear" w:color="auto" w:fill="FFFFFF"/>
           </w:tcPr>
           <w:p/>
           <w:p>
             <w:pPr>
-              <w:spacing w:after="60"/>
+              <w:spacing w:after="40"/>
             </w:pPr>
             <w:r>
               <w:rPr>
@@ -1290,16 +1266,13 @@
         </w:tc>
         <w:tc>
           <w:tcPr>
-            <w:tcW w:type="dxa" w:w="1701"/>
-            <w:shd w:val="clear" w:color="auto" w:fill="0A0A0A"/>
-            <w:tcBorders>
-              <w:bottom w:val="single" w:sz="4" w:space="0" w:color="222222"/>
-            </w:tcBorders>
+            <w:tcW w:type="dxa" w:w="1984"/>
+            <w:shd w:val="clear" w:color="auto" w:fill="FFFFFF"/>
           </w:tcPr>
           <w:p/>
           <w:p>
             <w:pPr>
-              <w:spacing w:after="60"/>
+              <w:spacing w:after="40"/>
               <w:jc w:val="right"/>
             </w:pPr>
             <w:r>
@@ -1307,7 +1280,7 @@
                 <w:rFonts w:ascii="Courier New" w:hAnsi="Courier New"/>
                 <w:b w:val="0"/>
                 <w:i w:val="0"/>
-                <w:color w:val="C8C8C8"/>
+                <w:color w:val="0A0A0A"/>
                 <w:sz w:val="18"/>
               </w:rPr>
               <w:t>—</w:t>
@@ -1318,21 +1291,24 @@
       <w:tr>
         <w:tc>
           <w:tcPr>
-            <w:tcW w:type="dxa" w:w="2551"/>
-            <w:shd w:val="clear" w:color="auto" w:fill="0A0A0A"/>
+            <w:tcW w:type="dxa" w:w="2268"/>
+            <w:shd w:val="clear" w:color="auto" w:fill="FFFFFF"/>
+            <w:tcBorders>
+              <w:top w:val="single" w:sz="4" w:space="0" w:color="DDDDDD"/>
+            </w:tcBorders>
           </w:tcPr>
           <w:p/>
           <w:p>
             <w:pPr>
-              <w:spacing w:after="60"/>
+              <w:spacing w:after="40"/>
             </w:pPr>
             <w:r>
               <w:rPr>
                 <w:rFonts w:ascii="Courier New" w:hAnsi="Courier New"/>
-                <w:b w:val="0"/>
+                <w:b/>
                 <w:i w:val="0"/>
-                <w:color w:val="C8FF00"/>
-                <w:sz w:val="16"/>
+                <w:color w:val="0A0A0A"/>
+                <w:sz w:val="15"/>
               </w:rPr>
               <w:t>TOTAL DUE</w:t>
             </w:r>
@@ -1340,13 +1316,16 @@
         </w:tc>
         <w:tc>
           <w:tcPr>
-            <w:tcW w:type="dxa" w:w="1701"/>
-            <w:shd w:val="clear" w:color="auto" w:fill="0A0A0A"/>
+            <w:tcW w:type="dxa" w:w="1984"/>
+            <w:shd w:val="clear" w:color="auto" w:fill="FFFFFF"/>
+            <w:tcBorders>
+              <w:top w:val="single" w:sz="4" w:space="0" w:color="DDDDDD"/>
+            </w:tcBorders>
           </w:tcPr>
           <w:p/>
           <w:p>
             <w:pPr>
-              <w:spacing w:after="60"/>
+              <w:spacing w:after="40"/>
               <w:jc w:val="right"/>
             </w:pPr>
             <w:r>
@@ -1354,7 +1333,7 @@
                 <w:rFonts w:ascii="Courier New" w:hAnsi="Courier New"/>
                 <w:b/>
                 <w:i w:val="0"/>
-                <w:color w:val="FFFFFF"/>
+                <w:color w:val="0A0A0A"/>
                 <w:sz w:val="26"/>
               </w:rPr>
               <w:t>$15,100.00</w:t>
@@ -1366,6 +1345,14 @@
     <w:p>
       <w:pPr>
         <w:spacing w:after="120"/>
+      </w:pPr>
+    </w:p>
+    <w:p>
+      <w:pPr>
+        <w:spacing w:before="0" w:after="80"/>
+        <w:pBdr>
+          <w:bottom w:val="single" w:sz="4" w:space="1" w:color="DDDDDD"/>
+        </w:pBdr>
       </w:pPr>
     </w:p>
     <w:tbl>
@@ -1388,26 +1375,25 @@
       <w:tr>
         <w:tc>
           <w:tcPr>
-            <w:tcW w:type="dxa" w:w="9866"/>
-            <w:shd w:val="clear" w:color="auto" w:fill="161616"/>
+            <w:tcW w:type="dxa" w:w="9865"/>
+            <w:shd w:val="clear" w:color="auto" w:fill="F5F5F5"/>
             <w:tcBorders>
-              <w:top w:val="single" w:sz="4" w:space="0" w:color="222222"/>
-              <w:bottom w:val="single" w:sz="4" w:space="0" w:color="222222"/>
-              <w:left w:val="single" w:sz="12" w:space="0" w:color="C8FF00"/>
-              <w:right w:val="single" w:sz="4" w:space="0" w:color="222222"/>
+              <w:top w:val="single" w:sz="4" w:space="0" w:color="DDDDDD"/>
+              <w:bottom w:val="single" w:sz="4" w:space="0" w:color="DDDDDD"/>
+              <w:left w:val="single" w:sz="18" w:space="0" w:color="C8FF00"/>
+              <w:right w:val="single" w:sz="4" w:space="0" w:color="DDDDDD"/>
             </w:tcBorders>
           </w:tcPr>
           <w:p/>
           <w:p>
             <w:pPr>
-              <w:spacing w:after="60"/>
+              <w:spacing w:after="40" w:before="160"/>
             </w:pPr>
             <w:r>
               <w:rPr>
                 <w:rFonts w:ascii="Courier New" w:hAnsi="Courier New"/>
-                <w:b/>
-                <w:color w:val="C8FF00"/>
-                <w:sz w:val="15"/>
+                <w:color w:val="888888"/>
+                <w:sz w:val="14"/>
               </w:rPr>
               <w:t>PAYMENT INSTRUCTIONS</w:t>
             </w:r>
@@ -1435,7 +1421,7 @@
               <w:tc>
                 <w:tcPr>
                   <w:tcW w:type="dxa" w:w="2466"/>
-                  <w:shd w:val="clear" w:color="auto" w:fill="161616"/>
+                  <w:shd w:val="clear" w:color="auto" w:fill="F5F5F5"/>
                 </w:tcPr>
                 <w:p/>
                 <w:p>
@@ -1457,7 +1443,7 @@
               <w:tc>
                 <w:tcPr>
                   <w:tcW w:type="dxa" w:w="2466"/>
-                  <w:shd w:val="clear" w:color="auto" w:fill="161616"/>
+                  <w:shd w:val="clear" w:color="auto" w:fill="F5F5F5"/>
                 </w:tcPr>
                 <w:p/>
                 <w:p>
@@ -1469,7 +1455,7 @@
                       <w:rFonts w:ascii="Courier New" w:hAnsi="Courier New"/>
                       <w:b w:val="0"/>
                       <w:i w:val="0"/>
-                      <w:color w:val="FFFFFF"/>
+                      <w:color w:val="0A0A0A"/>
                       <w:sz w:val="18"/>
                     </w:rPr>
                     <w:t>Bank Name</w:t>
@@ -1479,7 +1465,7 @@
               <w:tc>
                 <w:tcPr>
                   <w:tcW w:type="dxa" w:w="2466"/>
-                  <w:shd w:val="clear" w:color="auto" w:fill="161616"/>
+                  <w:shd w:val="clear" w:color="auto" w:fill="F5F5F5"/>
                 </w:tcPr>
                 <w:p/>
                 <w:p>
@@ -1501,7 +1487,7 @@
               <w:tc>
                 <w:tcPr>
                   <w:tcW w:type="dxa" w:w="2466"/>
-                  <w:shd w:val="clear" w:color="auto" w:fill="161616"/>
+                  <w:shd w:val="clear" w:color="auto" w:fill="F5F5F5"/>
                 </w:tcPr>
                 <w:p/>
                 <w:p>
@@ -1513,7 +1499,7 @@
                       <w:rFonts w:ascii="Courier New" w:hAnsi="Courier New"/>
                       <w:b w:val="0"/>
                       <w:i w:val="0"/>
-                      <w:color w:val="FFFFFF"/>
+                      <w:color w:val="0A0A0A"/>
                       <w:sz w:val="18"/>
                     </w:rPr>
                     <w:t>Boring Science LLC</w:t>
@@ -1525,7 +1511,7 @@
               <w:tc>
                 <w:tcPr>
                   <w:tcW w:type="dxa" w:w="2466"/>
-                  <w:shd w:val="clear" w:color="auto" w:fill="161616"/>
+                  <w:shd w:val="clear" w:color="auto" w:fill="F5F5F5"/>
                 </w:tcPr>
                 <w:p/>
                 <w:p>
@@ -1547,7 +1533,7 @@
               <w:tc>
                 <w:tcPr>
                   <w:tcW w:type="dxa" w:w="2466"/>
-                  <w:shd w:val="clear" w:color="auto" w:fill="161616"/>
+                  <w:shd w:val="clear" w:color="auto" w:fill="F5F5F5"/>
                 </w:tcPr>
                 <w:p/>
                 <w:p>
@@ -1559,7 +1545,7 @@
                       <w:rFonts w:ascii="Courier New" w:hAnsi="Courier New"/>
                       <w:b w:val="0"/>
                       <w:i w:val="0"/>
-                      <w:color w:val="FFFFFF"/>
+                      <w:color w:val="0A0A0A"/>
                       <w:sz w:val="18"/>
                     </w:rPr>
                     <w:t>XXXX-XXXX-XXXX</w:t>
@@ -1569,7 +1555,7 @@
               <w:tc>
                 <w:tcPr>
                   <w:tcW w:type="dxa" w:w="2466"/>
-                  <w:shd w:val="clear" w:color="auto" w:fill="161616"/>
+                  <w:shd w:val="clear" w:color="auto" w:fill="F5F5F5"/>
                 </w:tcPr>
                 <w:p/>
                 <w:p>
@@ -1591,7 +1577,7 @@
               <w:tc>
                 <w:tcPr>
                   <w:tcW w:type="dxa" w:w="2466"/>
-                  <w:shd w:val="clear" w:color="auto" w:fill="161616"/>
+                  <w:shd w:val="clear" w:color="auto" w:fill="F5F5F5"/>
                 </w:tcPr>
                 <w:p/>
                 <w:p>
@@ -1603,7 +1589,7 @@
                       <w:rFonts w:ascii="Courier New" w:hAnsi="Courier New"/>
                       <w:b w:val="0"/>
                       <w:i w:val="0"/>
-                      <w:color w:val="FFFFFF"/>
+                      <w:color w:val="0A0A0A"/>
                       <w:sz w:val="18"/>
                     </w:rPr>
                     <w:t>XXXXXXXXX</w:t>
@@ -1615,7 +1601,7 @@
               <w:tc>
                 <w:tcPr>
                   <w:tcW w:type="dxa" w:w="2466"/>
-                  <w:shd w:val="clear" w:color="auto" w:fill="161616"/>
+                  <w:shd w:val="clear" w:color="auto" w:fill="F5F5F5"/>
                 </w:tcPr>
                 <w:p/>
                 <w:p>
@@ -1637,7 +1623,7 @@
               <w:tc>
                 <w:tcPr>
                   <w:tcW w:type="dxa" w:w="2466"/>
-                  <w:shd w:val="clear" w:color="auto" w:fill="161616"/>
+                  <w:shd w:val="clear" w:color="auto" w:fill="F5F5F5"/>
                 </w:tcPr>
                 <w:p/>
                 <w:p>
@@ -1649,7 +1635,7 @@
                       <w:rFonts w:ascii="Courier New" w:hAnsi="Courier New"/>
                       <w:b w:val="0"/>
                       <w:i w:val="0"/>
-                      <w:color w:val="FFFFFF"/>
+                      <w:color w:val="0A0A0A"/>
                       <w:sz w:val="18"/>
                     </w:rPr>
                     <w:t>#INV-2026-001</w:t>
@@ -1659,7 +1645,7 @@
               <w:tc>
                 <w:tcPr>
                   <w:tcW w:type="dxa" w:w="2466"/>
-                  <w:shd w:val="clear" w:color="auto" w:fill="161616"/>
+                  <w:shd w:val="clear" w:color="auto" w:fill="F5F5F5"/>
                 </w:tcPr>
                 <w:p/>
                 <w:p>
@@ -1681,7 +1667,7 @@
               <w:tc>
                 <w:tcPr>
                   <w:tcW w:type="dxa" w:w="2466"/>
-                  <w:shd w:val="clear" w:color="auto" w:fill="161616"/>
+                  <w:shd w:val="clear" w:color="auto" w:fill="F5F5F5"/>
                 </w:tcPr>
                 <w:p/>
                 <w:p>
@@ -1693,7 +1679,7 @@
                       <w:rFonts w:ascii="Courier New" w:hAnsi="Courier New"/>
                       <w:b w:val="0"/>
                       <w:i w:val="0"/>
-                      <w:color w:val="FFFFFF"/>
+                      <w:color w:val="0A0A0A"/>
                       <w:sz w:val="18"/>
                     </w:rPr>
                     <w:t>ACH · Check · Stripe</w:t>
@@ -1703,6 +1689,11 @@
             </w:tr>
           </w:tbl>
           <w:p/>
+          <w:p>
+            <w:pPr>
+              <w:spacing w:after="120"/>
+            </w:pPr>
+          </w:p>
         </w:tc>
       </w:tr>
     </w:tbl>
@@ -1713,22 +1704,20 @@
     </w:p>
     <w:p>
       <w:pPr>
-        <w:spacing w:after="60"/>
+        <w:spacing w:after="40"/>
       </w:pPr>
       <w:r>
         <w:rPr>
           <w:rFonts w:ascii="Courier New" w:hAnsi="Courier New"/>
-          <w:b/>
-          <w:i w:val="0"/>
-          <w:color w:val="C8FF00"/>
-          <w:sz w:val="15"/>
+          <w:color w:val="888888"/>
+          <w:sz w:val="14"/>
         </w:rPr>
         <w:t>NOTES</w:t>
       </w:r>
     </w:p>
     <w:p>
       <w:pPr>
-        <w:spacing w:after="200"/>
+        <w:spacing w:after="160"/>
       </w:pPr>
       <w:r>
         <w:rPr>
@@ -1738,14 +1727,14 @@
           <w:color w:val="888888"/>
           <w:sz w:val="17"/>
         </w:rPr>
-        <w:t>Payment is due within 30 days of the invoice date. Late payments are subject to a 1.5% monthly interest charge. Please include the invoice number in your payment reference. For questions, contact inquiries@boringscience.bio.</w:t>
+        <w:t>Payment is due within 30 days of the invoice date. Late payments are subject to a 1.5% monthly interest charge. Please include the invoice number in your payment reference. Questions: inquiries@boringscience.bio</w:t>
       </w:r>
     </w:p>
     <w:p>
       <w:pPr>
-        <w:spacing w:before="0" w:after="120"/>
+        <w:spacing w:before="0" w:after="80"/>
         <w:pBdr>
-          <w:bottom w:val="single" w:sz="4" w:space="1" w:color="222222"/>
+          <w:bottom w:val="single" w:sz="4" w:space="1" w:color="DDDDDD"/>
         </w:pBdr>
       </w:pPr>
     </w:p>
@@ -1753,6 +1742,7 @@
       <w:tblPr>
         <w:tblW w:type="auto" w:w="0"/>
         <w:tblLook w:firstColumn="1" w:firstRow="1" w:lastColumn="0" w:lastRow="0" w:noHBand="0" w:noVBand="1" w:val="04A0"/>
+        <w:jc w:val="center"/>
         <w:tblBorders>
           <w:top w:val="none"/>
           <w:left w:val="none"/>
@@ -1769,8 +1759,8 @@
       <w:tr>
         <w:tc>
           <w:tcPr>
-            <w:tcW w:type="dxa" w:w="4933"/>
-            <w:shd w:val="clear" w:color="auto" w:fill="0A0A0A"/>
+            <w:tcW w:type="dxa" w:w="5386"/>
+            <w:shd w:val="clear" w:color="auto" w:fill="FFFFFF"/>
           </w:tcPr>
           <w:p/>
           <w:p>
@@ -1780,16 +1770,16 @@
                 <w:b w:val="0"/>
                 <w:i w:val="0"/>
                 <w:color w:val="888888"/>
-                <w:sz w:val="15"/>
+                <w:sz w:val="14"/>
               </w:rPr>
-              <w:t>Boring Science LLC  ·  Incorporated 2026  ·  Sunnyvale, CA  ·  boringscience.bio</w:t>
+              <w:t>© 2026 BORING SCIENCE LLC  ·  boringscience.bio  ·  408.368.9547</w:t>
             </w:r>
           </w:p>
         </w:tc>
         <w:tc>
           <w:tcPr>
-            <w:tcW w:type="dxa" w:w="4933"/>
-            <w:shd w:val="clear" w:color="auto" w:fill="0A0A0A"/>
+            <w:tcW w:type="dxa" w:w="4479"/>
+            <w:shd w:val="clear" w:color="auto" w:fill="FFFFFF"/>
           </w:tcPr>
           <w:p/>
           <w:p>
@@ -1802,9 +1792,407 @@
                 <w:b w:val="0"/>
                 <w:i/>
                 <w:color w:val="888888"/>
-                <w:sz w:val="19"/>
+                <w:sz w:val="18"/>
               </w:rPr>
               <w:t>Science is unpredictable. Your invoices shouldn't be.</w:t>
+            </w:r>
+          </w:p>
+        </w:tc>
+      </w:tr>
+    </w:tbl>
+    <w:p>
+      <w:r>
+        <w:br w:type="page"/>
+      </w:r>
+    </w:p>
+    <w:tbl>
+      <w:tblPr>
+        <w:tblW w:type="auto" w:w="0"/>
+        <w:tblLook w:firstColumn="1" w:firstRow="1" w:lastColumn="0" w:lastRow="0" w:noHBand="0" w:noVBand="1" w:val="04A0"/>
+        <w:jc w:val="center"/>
+        <w:tblBorders>
+          <w:top w:val="none"/>
+          <w:left w:val="none"/>
+          <w:bottom w:val="none"/>
+          <w:right w:val="none"/>
+          <w:insideH w:val="none"/>
+          <w:insideV w:val="none"/>
+        </w:tblBorders>
+      </w:tblPr>
+      <w:tblGrid>
+        <w:gridCol w:w="9866"/>
+      </w:tblGrid>
+      <w:tr>
+        <w:tc>
+          <w:tcPr>
+            <w:tcW w:type="dxa" w:w="9865"/>
+            <w:shd w:val="clear" w:color="auto" w:fill="0A0A0A"/>
+          </w:tcPr>
+          <w:p/>
+          <w:p>
+            <w:pPr>
+              <w:spacing w:before="0" w:after="200"/>
+              <w:jc w:val="center"/>
+            </w:pPr>
+          </w:p>
+          <w:p>
+            <w:pPr>
+              <w:spacing w:before="0" w:after="200"/>
+              <w:jc w:val="center"/>
+            </w:pPr>
+          </w:p>
+          <w:p>
+            <w:pPr>
+              <w:spacing w:before="0" w:after="200"/>
+              <w:jc w:val="center"/>
+            </w:pPr>
+          </w:p>
+          <w:p>
+            <w:pPr>
+              <w:spacing w:before="0" w:after="200"/>
+              <w:jc w:val="center"/>
+            </w:pPr>
+          </w:p>
+          <w:p>
+            <w:pPr>
+              <w:spacing w:before="0" w:after="120"/>
+              <w:jc w:val="center"/>
+            </w:pPr>
+            <w:r>
+              <w:rPr>
+                <w:rFonts w:ascii="Courier New" w:hAnsi="Courier New"/>
+                <w:b/>
+                <w:color w:val="FFFFFF"/>
+                <w:sz w:val="80"/>
+              </w:rPr>
+              <w:t xml:space="preserve">BORING </w:t>
+            </w:r>
+            <w:r>
+              <w:rPr>
+                <w:rFonts w:ascii="Courier New" w:hAnsi="Courier New"/>
+                <w:b/>
+                <w:color w:val="C8FF00"/>
+                <w:sz w:val="80"/>
+              </w:rPr>
+              <w:t>SCIENCE</w:t>
+            </w:r>
+          </w:p>
+          <w:p>
+            <w:pPr>
+              <w:spacing w:before="0" w:after="640"/>
+              <w:jc w:val="center"/>
+            </w:pPr>
+            <w:r>
+              <w:rPr>
+                <w:rFonts w:ascii="Georgia" w:hAnsi="Georgia"/>
+                <w:b w:val="0"/>
+                <w:i/>
+                <w:color w:val="BBBBBB"/>
+                <w:sz w:val="28"/>
+              </w:rPr>
+              <w:t>Science is unpredictable. Your data shouldn't be.</w:t>
+            </w:r>
+          </w:p>
+          <w:p>
+            <w:pPr>
+              <w:spacing w:after="400"/>
+              <w:jc w:val="center"/>
+            </w:pPr>
+            <w:r>
+              <w:rPr>
+                <w:rFonts w:ascii="Courier New" w:hAnsi="Courier New"/>
+                <w:color w:val="444444"/>
+                <w:sz w:val="16"/>
+              </w:rPr>
+              <w:t>────────────────────────────────────────────────</w:t>
+            </w:r>
+          </w:p>
+          <w:p>
+            <w:pPr>
+              <w:spacing w:before="0" w:after="320"/>
+              <w:jc w:val="center"/>
+            </w:pPr>
+            <w:r>
+              <w:rPr>
+                <w:rFonts w:ascii="Courier New" w:hAnsi="Courier New"/>
+                <w:b w:val="0"/>
+                <w:i w:val="0"/>
+                <w:color w:val="C8FF00"/>
+                <w:sz w:val="16"/>
+              </w:rPr>
+              <w:t>WHAT WE BUILD</w:t>
+            </w:r>
+          </w:p>
+          <w:p>
+            <w:pPr>
+              <w:spacing w:after="140"/>
+              <w:jc w:val="center"/>
+            </w:pPr>
+            <w:r>
+              <w:rPr>
+                <w:rFonts w:ascii="Courier New" w:hAnsi="Courier New"/>
+                <w:b/>
+                <w:color w:val="C8FF00"/>
+                <w:sz w:val="18"/>
+              </w:rPr>
+              <w:t xml:space="preserve">COMPUTATIONAL BIOLOGY   </w:t>
+            </w:r>
+            <w:r>
+              <w:rPr>
+                <w:rFonts w:ascii="Calibri" w:hAnsi="Calibri"/>
+                <w:color w:val="BBBBBB"/>
+                <w:sz w:val="18"/>
+              </w:rPr>
+              <w:t>Protein structure · Molecular docking · ML/AI pipelines</w:t>
+            </w:r>
+          </w:p>
+          <w:p>
+            <w:pPr>
+              <w:spacing w:after="140"/>
+              <w:jc w:val="center"/>
+            </w:pPr>
+            <w:r>
+              <w:rPr>
+                <w:rFonts w:ascii="Courier New" w:hAnsi="Courier New"/>
+                <w:b/>
+                <w:color w:val="C8FF00"/>
+                <w:sz w:val="18"/>
+              </w:rPr>
+              <w:t xml:space="preserve">NGS &amp; GENOMICS   </w:t>
+            </w:r>
+            <w:r>
+              <w:rPr>
+                <w:rFonts w:ascii="Calibri" w:hAnsi="Calibri"/>
+                <w:color w:val="BBBBBB"/>
+                <w:sz w:val="18"/>
+              </w:rPr>
+              <w:t>WGS · RNA-seq · ChIP-seq · Variant calling · GWAS</w:t>
+            </w:r>
+          </w:p>
+          <w:p>
+            <w:pPr>
+              <w:spacing w:after="140"/>
+              <w:jc w:val="center"/>
+            </w:pPr>
+            <w:r>
+              <w:rPr>
+                <w:rFonts w:ascii="Courier New" w:hAnsi="Courier New"/>
+                <w:b/>
+                <w:color w:val="C8FF00"/>
+                <w:sz w:val="18"/>
+              </w:rPr>
+              <w:t xml:space="preserve">DATA INFRASTRUCTURE   </w:t>
+            </w:r>
+            <w:r>
+              <w:rPr>
+                <w:rFonts w:ascii="Calibri" w:hAnsi="Calibri"/>
+                <w:color w:val="BBBBBB"/>
+                <w:sz w:val="18"/>
+              </w:rPr>
+              <w:t>Nextflow · Snakemake · Cloud HPC · Reproducibility</w:t>
+            </w:r>
+          </w:p>
+          <w:p>
+            <w:pPr>
+              <w:spacing w:after="140"/>
+              <w:jc w:val="center"/>
+            </w:pPr>
+            <w:r>
+              <w:rPr>
+                <w:rFonts w:ascii="Courier New" w:hAnsi="Courier New"/>
+                <w:b/>
+                <w:color w:val="C8FF00"/>
+                <w:sz w:val="18"/>
+              </w:rPr>
+              <w:t xml:space="preserve">SOFTWARE &amp; LICENSING   </w:t>
+            </w:r>
+            <w:r>
+              <w:rPr>
+                <w:rFonts w:ascii="Calibri" w:hAnsi="Calibri"/>
+                <w:color w:val="BBBBBB"/>
+                <w:sz w:val="18"/>
+              </w:rPr>
+              <w:t>bsdock · boringlab · Custom bioinformatics tooling</w:t>
+            </w:r>
+          </w:p>
+          <w:p>
+            <w:pPr>
+              <w:spacing w:before="0" w:after="480"/>
+              <w:jc w:val="center"/>
+            </w:pPr>
+          </w:p>
+          <w:p>
+            <w:pPr>
+              <w:spacing w:after="400"/>
+              <w:jc w:val="center"/>
+            </w:pPr>
+            <w:r>
+              <w:rPr>
+                <w:rFonts w:ascii="Courier New" w:hAnsi="Courier New"/>
+                <w:color w:val="444444"/>
+                <w:sz w:val="16"/>
+              </w:rPr>
+              <w:t>────────────────────────────────────────────────</w:t>
+            </w:r>
+          </w:p>
+          <w:p>
+            <w:pPr>
+              <w:spacing w:before="0" w:after="80"/>
+              <w:jc w:val="center"/>
+            </w:pPr>
+            <w:r>
+              <w:rPr>
+                <w:rFonts w:ascii="Calibri" w:hAnsi="Calibri"/>
+                <w:b w:val="0"/>
+                <w:i w:val="0"/>
+                <w:color w:val="BBBBBB"/>
+                <w:sz w:val="21"/>
+              </w:rPr>
+              <w:t>Boring Science builds the rigorous data infrastructure that turns data points into</w:t>
+            </w:r>
+          </w:p>
+          <w:p>
+            <w:pPr>
+              <w:spacing w:before="0" w:after="560"/>
+              <w:jc w:val="center"/>
+            </w:pPr>
+            <w:r>
+              <w:rPr>
+                <w:rFonts w:ascii="Calibri" w:hAnsi="Calibri"/>
+                <w:b w:val="0"/>
+                <w:i w:val="0"/>
+                <w:color w:val="BBBBBB"/>
+                <w:sz w:val="21"/>
+              </w:rPr>
+              <w:t>discovery — clean, structured, reproducible, and audit-ready.</w:t>
+            </w:r>
+          </w:p>
+          <w:p>
+            <w:pPr>
+              <w:spacing w:after="400"/>
+              <w:jc w:val="center"/>
+            </w:pPr>
+            <w:r>
+              <w:rPr>
+                <w:rFonts w:ascii="Courier New" w:hAnsi="Courier New"/>
+                <w:color w:val="444444"/>
+                <w:sz w:val="16"/>
+              </w:rPr>
+              <w:t>────────────────────────────────────────────────</w:t>
+            </w:r>
+          </w:p>
+          <w:p>
+            <w:pPr>
+              <w:spacing w:before="0" w:after="280"/>
+              <w:jc w:val="center"/>
+            </w:pPr>
+            <w:r>
+              <w:rPr>
+                <w:rFonts w:ascii="Courier New" w:hAnsi="Courier New"/>
+                <w:b w:val="0"/>
+                <w:i w:val="0"/>
+                <w:color w:val="C8FF00"/>
+                <w:sz w:val="16"/>
+              </w:rPr>
+              <w:t>GET IN TOUCH</w:t>
+            </w:r>
+          </w:p>
+          <w:p>
+            <w:pPr>
+              <w:spacing w:before="0" w:after="120"/>
+              <w:jc w:val="center"/>
+            </w:pPr>
+            <w:r>
+              <w:rPr>
+                <w:rFonts w:ascii="Courier New" w:hAnsi="Courier New"/>
+                <w:b w:val="0"/>
+                <w:i w:val="0"/>
+                <w:color w:val="FFFFFF"/>
+                <w:sz w:val="20"/>
+              </w:rPr>
+              <w:t>boringscience.bio</w:t>
+            </w:r>
+          </w:p>
+          <w:p>
+            <w:pPr>
+              <w:spacing w:before="0" w:after="120"/>
+              <w:jc w:val="center"/>
+            </w:pPr>
+            <w:r>
+              <w:rPr>
+                <w:rFonts w:ascii="Courier New" w:hAnsi="Courier New"/>
+                <w:b w:val="0"/>
+                <w:i w:val="0"/>
+                <w:color w:val="BBBBBB"/>
+                <w:sz w:val="20"/>
+              </w:rPr>
+              <w:t>inquiries@boringscience.bio</w:t>
+            </w:r>
+          </w:p>
+          <w:p>
+            <w:pPr>
+              <w:spacing w:before="0" w:after="120"/>
+              <w:jc w:val="center"/>
+            </w:pPr>
+            <w:r>
+              <w:rPr>
+                <w:rFonts w:ascii="Courier New" w:hAnsi="Courier New"/>
+                <w:b w:val="0"/>
+                <w:i w:val="0"/>
+                <w:color w:val="BBBBBB"/>
+                <w:sz w:val="20"/>
+              </w:rPr>
+              <w:t>408.368.9547</w:t>
+            </w:r>
+          </w:p>
+          <w:p>
+            <w:pPr>
+              <w:spacing w:before="0" w:after="120"/>
+              <w:jc w:val="center"/>
+            </w:pPr>
+            <w:r>
+              <w:rPr>
+                <w:rFonts w:ascii="Courier New" w:hAnsi="Courier New"/>
+                <w:b w:val="0"/>
+                <w:i w:val="0"/>
+                <w:color w:val="BBBBBB"/>
+                <w:sz w:val="20"/>
+              </w:rPr>
+              <w:t>Sunnyvale, CA  ·  Ottawa, ON</w:t>
+            </w:r>
+          </w:p>
+          <w:p>
+            <w:pPr>
+              <w:spacing w:before="0" w:after="240"/>
+              <w:jc w:val="center"/>
+            </w:pPr>
+          </w:p>
+          <w:p>
+            <w:pPr>
+              <w:spacing w:before="0" w:after="240"/>
+              <w:jc w:val="center"/>
+            </w:pPr>
+          </w:p>
+          <w:p>
+            <w:pPr>
+              <w:spacing w:before="0" w:after="240"/>
+              <w:jc w:val="center"/>
+            </w:pPr>
+          </w:p>
+          <w:p>
+            <w:pPr>
+              <w:spacing w:before="0" w:after="200"/>
+              <w:jc w:val="center"/>
+            </w:pPr>
+            <w:r>
+              <w:rPr>
+                <w:rFonts w:ascii="Courier New" w:hAnsi="Courier New"/>
+                <w:b w:val="0"/>
+                <w:i w:val="0"/>
+                <w:color w:val="444444"/>
+                <w:sz w:val="14"/>
+              </w:rPr>
+              <w:t>© 2026 BORING SCIENCE LLC  ·  ALL RIGHTS RESERVED</w:t>
             </w:r>
           </w:p>
         </w:tc>

</xml_diff>